<commit_message>
Actualizar el informe de avance con la existencia por lote, la politica de latencia y las cifras al 20 de octubre
</commit_message>
<xml_diff>
--- a/FASE 2/Evidencias Grupales/2.4_Guía Estudiante_Fase 2_Desarrollo Proyecto APT.docx
+++ b/FASE 2/Evidencias Grupales/2.4_Guía Estudiante_Fase 2_Desarrollo Proyecto APT.docx
@@ -704,7 +704,7 @@
                 <w:szCs w:val="20"/>
                 <w:lang w:eastAsia="es-CL"/>
               </w:rPr>
-              <w:t>Objetivo específico 1, modelo de datos. Cumplido. Se implementó el esquema definitivo de 29 tablas sobre una persistencia dual: SQLite en el terminal del local y PostgreSQL en la nube. El esquema evoluciona mediante 13 migraciones versionadas y una tabla de control de migraciones, de modo que una instalación existente se actualiza sin pérdida de datos.</w:t>
+              <w:t>Objetivo específico 1, modelo de datos. Cumplido. Se implementó el esquema definitivo de 30 tablas sobre una persistencia dual: SQLite en el terminal del local y PostgreSQL en la nube. El esquema evoluciona mediante 16 migraciones versionadas y una tabla de control de migraciones, de modo que una instalación existente se actualiza sin pérdida de datos.</w:t>
             </w:r>
           </w:p>
           <w:p>
@@ -797,7 +797,7 @@
                 <w:szCs w:val="20"/>
                 <w:lang w:eastAsia="es-CL"/>
               </w:rPr>
-              <w:t xml:space="preserve">Objetivo específico 4, cumplimiento normativo. Cumplido en su parte local. El sistema aplica el redondeo de efectivo de la Ley </w:t>
+              <w:t>Objetivo específico 4, cumplimiento normativo. Cumplido en su parte local. El sistema aplica el redondeo de efectivo de la Ley N° 20.956, el impuesto al valor agregado del 19 %, los códigos de impuesto adicional a las bebidas alcohólicas, el control de vencimientos por el método FEFO que exige el D.S. N° 977/96 del MINSAL y la emisión local de documentos tributarios electrónicos con timbre electrónico. El control de vencimientos opera por lote: cada compra con fecha conocida registra su propia existencia, y la venta, la merma y la sincronización descuentan primero lo que vence antes. Queda pendiente la conexión con el Servicio de Impuestos Internos, prevista para la Fase 3.</w:t>
             </w:r>
             <w:proofErr w:type="spellStart"/>
             <w:r>
@@ -807,7 +807,6 @@
                 <w:szCs w:val="20"/>
                 <w:lang w:eastAsia="es-CL"/>
               </w:rPr>
-              <w:t>N°</w:t>
             </w:r>
             <w:proofErr w:type="spellEnd"/>
             <w:r>
@@ -817,7 +816,6 @@
                 <w:szCs w:val="20"/>
                 <w:lang w:eastAsia="es-CL"/>
               </w:rPr>
-              <w:t xml:space="preserve"> 20.956, el impuesto al valor agregado del 19 %, los códigos de impuesto adicional a las bebidas alcohólicas, el control de vencimientos por el método FEFO que exige el D.S. </w:t>
             </w:r>
             <w:proofErr w:type="spellStart"/>
             <w:r>
@@ -827,7 +825,6 @@
                 <w:szCs w:val="20"/>
                 <w:lang w:eastAsia="es-CL"/>
               </w:rPr>
-              <w:t>N°</w:t>
             </w:r>
             <w:proofErr w:type="spellEnd"/>
             <w:r>
@@ -837,17 +834,14 @@
                 <w:szCs w:val="20"/>
                 <w:lang w:eastAsia="es-CL"/>
               </w:rPr>
-              <w:t xml:space="preserve"> 977/96 del MINSAL y la emisión </w:t>
-            </w:r>
-            <w:r>
-              <w:rPr>
-                <w:rFonts w:ascii="Calibri" w:hAnsi="Calibri" w:cs="Arial"/>
-                <w:sz w:val="20"/>
-                <w:szCs w:val="20"/>
-                <w:lang w:eastAsia="es-CL"/>
-              </w:rPr>
-              <w:lastRenderedPageBreak/>
-              <w:t>local de documentos tributarios electrónicos con timbre electrónico. Queda pendiente la conexión con el Servicio de Impuestos Internos, prevista para la Fase 3.</w:t>
+            </w:r>
+            <w:r>
+              <w:rPr>
+                <w:rFonts w:ascii="Calibri" w:hAnsi="Calibri" w:cs="Arial"/>
+                <w:sz w:val="20"/>
+                <w:szCs w:val="20"/>
+                <w:lang w:eastAsia="es-CL"/>
+              </w:rPr>
             </w:r>
           </w:p>
           <w:p>
@@ -1331,16 +1325,15 @@
                 <w:szCs w:val="20"/>
                 <w:lang w:eastAsia="es-CL"/>
               </w:rPr>
-              <w:t>Evidencia 1. Repositorio Git del proyecto de título, con historial por integrante. Contiene 101 confirmaciones de cambios entre el 28 de agosto y el 13 de octubre de 2026, de las cuales 51 corresponden a Marcelo Pino y 50 a David Miranda, organizadas en la estructura de carpetas por fase y tipo de evidencia que exige la asignatura, con los nombres de archivo en el formato solicitado. El desarrollo diario se versiona además en el repositorio de trabajo del equipo, que acumula 57 confirmaciones, y cuyos avanc</w:t>
-            </w:r>
-            <w:r>
-              <w:rPr>
-                <w:rFonts w:ascii="Calibri" w:hAnsi="Calibri" w:cs="Arial"/>
-                <w:sz w:val="20"/>
-                <w:szCs w:val="20"/>
-                <w:lang w:eastAsia="es-CL"/>
-              </w:rPr>
-              <w:t>es se incorporan al repositorio de título como evidencia de sistema. La totalidad de las evidencias descritas en este informe se encuentra confirmada en el repositorio remoto, de modo que su autoría y su fecha son verificables sin recurrir a archivos locales.</w:t>
+              <w:t>Evidencia 1. Repositorio Git del proyecto de título, con historial por integrante. Contiene 120 confirmaciones de cambios entre el 28 de agosto y el 20 de octubre de 2026, de las cuales 62 corresponden a Marcelo Pino y 58 a David Miranda, organizadas en la estructura de carpetas por fase y tipo de evidencia que exige la asignatura, con los nombres de archivo en el formato solicitado. El desarrollo diario se versiona además en el repositorio de trabajo del equipo, cuyos avances se incorporan al repositorio de título como evidencia de sistema. La totalidad de las evidencias descritas en este informe se encuentra confirmada en el repositorio remoto, de modo que su autoría y su fecha son verificables sin recurrir a archivos locales.</w:t>
+            </w:r>
+            <w:r>
+              <w:rPr>
+                <w:rFonts w:ascii="Calibri" w:hAnsi="Calibri" w:cs="Arial"/>
+                <w:sz w:val="20"/>
+                <w:szCs w:val="20"/>
+                <w:lang w:eastAsia="es-CL"/>
+              </w:rPr>
             </w:r>
           </w:p>
           <w:p>
@@ -1390,42 +1383,40 @@
                 <w:szCs w:val="20"/>
                 <w:lang w:eastAsia="es-CL"/>
               </w:rPr>
-              <w:lastRenderedPageBreak/>
-              <w:t>Evidencia 3. Modelo de datos implementado. Esquema de 29 tablas con 13 migraciones versionadas para cada motor de base de datos, aplicadas automáticamente al iniciar el sistema. Evidencia el diseño y la implementación de un modelo escalable en el tiempo, ya que una instalación existente se actualiza sin recrear el esquema ni perder información.</w:t>
-            </w:r>
-          </w:p>
-          <w:p>
-            <w:pPr>
-              <w:jc w:val="both"/>
-            </w:pPr>
-          </w:p>
-          <w:p>
-            <w:pPr>
-              <w:jc w:val="both"/>
-              <w:rPr>
-                <w:rFonts w:ascii="Calibri" w:hAnsi="Calibri" w:cs="Arial"/>
-                <w:sz w:val="20"/>
-                <w:szCs w:val="20"/>
-                <w:lang w:eastAsia="es-CL"/>
-              </w:rPr>
-            </w:pPr>
-            <w:r>
-              <w:rPr>
-                <w:rFonts w:ascii="Calibri" w:hAnsi="Calibri" w:cs="Arial"/>
-                <w:sz w:val="20"/>
-                <w:szCs w:val="20"/>
-                <w:lang w:eastAsia="es-CL"/>
-              </w:rPr>
-              <w:t xml:space="preserve">Evidencia 4. Batería de pruebas automatizadas. Sobre el servidor, 177 pruebas unitarias repartidas en once conjuntos y 81 pruebas de integración en quince conjuntos, que en conjunto ejercitan las 72 rutas de la interfaz de programación, sin dejar ninguna sin cubrir. Sobre la interfaz, 18 pruebas unitarias de sus reglas de negocio y 11 pruebas del contrato que la une al servidor. Sobre el sistema en ejecución, 92 comprobaciones de extremo a extremo, con reporte fechado por cada corrida; la última, del 11 de </w:t>
-            </w:r>
-            <w:r>
-              <w:rPr>
-                <w:rFonts w:ascii="Calibri" w:hAnsi="Calibri" w:cs="Arial"/>
-                <w:sz w:val="20"/>
-                <w:szCs w:val="20"/>
-                <w:lang w:eastAsia="es-CL"/>
-              </w:rPr>
-              <w:t>octubre de 2026, no registra fallas y deja 8 comprobaciones omitidas por depender de folios autorizados por el Servicio de Impuestos Internos. Evidencia el diseño y la aplicación de pruebas de validación del producto.</w:t>
+              <w:t>Evidencia 3. Modelo de datos implementado. Esquema de 30 tablas con 16 migraciones versionadas para cada motor de base de datos, aplicadas automáticamente al iniciar el sistema. Evidencia el diseño y la implementación de un modelo escalable en el tiempo, ya que una instalación existente se actualiza sin recrear el esquema ni perder información. Una suite de pruebas compara ambos esquemas tabla por tabla, de modo que una migración que alcance a un solo motor se detecta de inmediato.</w:t>
+            </w:r>
+          </w:p>
+          <w:p>
+            <w:pPr>
+              <w:jc w:val="both"/>
+            </w:pPr>
+          </w:p>
+          <w:p>
+            <w:pPr>
+              <w:jc w:val="both"/>
+              <w:rPr>
+                <w:rFonts w:ascii="Calibri" w:hAnsi="Calibri" w:cs="Arial"/>
+                <w:sz w:val="20"/>
+                <w:szCs w:val="20"/>
+                <w:lang w:eastAsia="es-CL"/>
+              </w:rPr>
+            </w:pPr>
+            <w:r>
+              <w:rPr>
+                <w:rFonts w:ascii="Calibri" w:hAnsi="Calibri" w:cs="Arial"/>
+                <w:sz w:val="20"/>
+                <w:szCs w:val="20"/>
+                <w:lang w:eastAsia="es-CL"/>
+              </w:rPr>
+              <w:t>Evidencia 4. Batería de pruebas automatizadas. Sobre el servidor, 210 pruebas unitarias repartidas en dieciséis conjuntos y 87 pruebas de integración en dieciséis conjuntos, que en conjunto ejercitan las 72 rutas de la interfaz de programación, sin dejar ninguna sin cubrir. Sobre la interfaz, 18 pruebas unitarias de sus reglas de negocio y 11 pruebas del contrato que la une al servidor. Sobre el sistema en ejecución, 92 comprobaciones de extremo a extremo, con reporte fechado por cada corrida. La batería se ejecuta contra los dos motores de base de datos, el de la nube y el del terminal, porque una sentencia válida en uno puede no estarlo en el otro. Evidencia el diseño y la aplicación de pruebas de validación del producto.</w:t>
+            </w:r>
+            <w:r>
+              <w:rPr>
+                <w:rFonts w:ascii="Calibri" w:hAnsi="Calibri" w:cs="Arial"/>
+                <w:sz w:val="20"/>
+                <w:szCs w:val="20"/>
+                <w:lang w:eastAsia="es-CL"/>
+              </w:rPr>
             </w:r>
           </w:p>
           <w:p>
@@ -3884,17 +3875,43 @@
                 <w:szCs w:val="20"/>
                 <w:lang w:eastAsia="es-CL"/>
               </w:rPr>
-              <w:t>Se incorporaron 18 pruebas unitarias de la interfaz, sobre sus reglas de negocio, y 11 pruebas del contrat</w:t>
-            </w:r>
-            <w:r>
-              <w:rPr>
-                <w:rFonts w:ascii="Calibri" w:hAnsi="Calibri" w:cs="Arial"/>
-                <w:sz w:val="20"/>
-                <w:szCs w:val="20"/>
-                <w:lang w:eastAsia="es-CL"/>
-              </w:rPr>
-              <w:lastRenderedPageBreak/>
-              <w:t>o que la une al servidor. La batería del servidor llegó a 177 pruebas unitarias y 81 de integración, con las 72 rutas cubiertas.</w:t>
+              <w:t>Se incorporaron 18 pruebas unitarias de la interfaz, sobre sus reglas de negocio, y 11 pruebas del contrato que la une al servidor. La batería del servidor llegó a 210 pruebas unitarias y 87 de integración, con las 72 rutas cubiertas.</w:t>
+            </w:r>
+            <w:r>
+              <w:rPr>
+                <w:rFonts w:ascii="Calibri" w:hAnsi="Calibri" w:cs="Arial"/>
+                <w:sz w:val="20"/>
+                <w:szCs w:val="20"/>
+                <w:lang w:eastAsia="es-CL"/>
+              </w:rPr>
+            </w:r>
+          </w:p>
+          <w:p>
+            <w:pPr>
+              <w:jc w:val="both"/>
+              <w:rPr>
+                <w:rFonts w:ascii="Calibri" w:hAnsi="Calibri" w:cs="Arial"/>
+                <w:sz w:val="20"/>
+                <w:szCs w:val="20"/>
+                <w:lang w:eastAsia="es-CL"/>
+              </w:rPr>
+            </w:pPr>
+            <w:r>
+              <w:rPr>
+                <w:rFonts w:ascii="Calibri" w:hAnsi="Calibri" w:cs="Arial"/>
+                <w:sz w:val="20"/>
+                <w:szCs w:val="20"/>
+                <w:lang w:eastAsia="es-CL"/>
+              </w:rPr>
+              <w:t>Se retiraron además las ocho aserciones que verificaban tiempos de respuesta dentro de pruebas de comportamiento. Una aserción de milisegundos no verifica el código: verifica la velocidad del equipo que la ejecuta. La medición se conserva y se informa, pero lo que se exige es un tope de regresión que solo detecta una operación que quedó colgada.</w:t>
+            </w:r>
+            <w:r>
+              <w:rPr>
+                <w:rFonts w:ascii="Calibri" w:hAnsi="Calibri" w:cs="Arial"/>
+                <w:sz w:val="20"/>
+                <w:szCs w:val="20"/>
+                <w:lang w:eastAsia="es-CL"/>
+              </w:rPr>
             </w:r>
           </w:p>
         </w:tc>
@@ -4670,7 +4687,7 @@
                 <w:szCs w:val="20"/>
                 <w:lang w:eastAsia="es-CL"/>
               </w:rPr>
-              <w:t>Por definir</w:t>
+              <w:t>Marcelo Pino</w:t>
             </w:r>
           </w:p>
         </w:tc>
@@ -4695,7 +4712,7 @@
                 <w:szCs w:val="20"/>
                 <w:lang w:eastAsia="es-CL"/>
               </w:rPr>
-              <w:t>Depende de que la interfaz esté estabilizada. Su postergación no bloquea otras actividades.</w:t>
+              <w:t>Facilitador: se verificó que el cliente de base de datos local funciona dentro del empaquetador, que era la condición que podía obligar a reescribirlo. Dificultad descartada: no requiere que la interfaz se congele, porque el empaquetado toma la aplicación ya construida.</w:t>
             </w:r>
           </w:p>
         </w:tc>
@@ -4745,7 +4762,7 @@
                 <w:szCs w:val="20"/>
                 <w:lang w:eastAsia="es-CL"/>
               </w:rPr>
-              <w:t>Programada para la Fase 3.</w:t>
+              <w:t>Se asignó responsable. Se midió el riesgo técnico antes de comprometer fecha: el entorno de escritorio incorpora la versión 24.22 del motor de ejecución, que expone el cliente de base de datos local empleado por el terminal, con las restricciones de integridad referencial activas. El riesgo queda descartado con evidencia y no se cambia de biblioteca.</w:t>
             </w:r>
           </w:p>
         </w:tc>
@@ -4968,6 +4985,666 @@
                 <w:lang w:eastAsia="es-CL"/>
               </w:rPr>
               <w:t>Se adelantó la gestión del contacto para no comprometer el cronograma de la Fase 3.</w:t>
+            </w:r>
+          </w:p>
+        </w:tc>
+      </w:tr>
+      <w:tr>
+        <w:tc>
+          <w:tcPr>
+            <w:tcW w:w="1328" w:type="dxa"/>
+          </w:tcPr>
+          <w:p>
+            <w:pPr>
+              <w:jc w:val="both"/>
+              <w:rPr>
+                <w:rFonts w:ascii="Calibri" w:hAnsi="Calibri" w:cs="Arial"/>
+                <w:sz w:val="20"/>
+                <w:szCs w:val="20"/>
+                <w:lang w:eastAsia="es-CL"/>
+              </w:rPr>
+            </w:pPr>
+            <w:r>
+              <w:rPr>
+                <w:rFonts w:ascii="Calibri" w:hAnsi="Calibri" w:cs="Arial"/>
+                <w:sz w:val="20"/>
+                <w:szCs w:val="20"/>
+                <w:lang w:eastAsia="es-CL"/>
+              </w:rPr>
+              <w:t>Desarrollar una solución de software que sistematice el proceso de desarrollo y mantenimiento.</w:t>
+            </w:r>
+          </w:p>
+        </w:tc>
+        <w:tc>
+          <w:tcPr>
+            <w:tcW w:w="1077" w:type="dxa"/>
+          </w:tcPr>
+          <w:p>
+            <w:pPr>
+              <w:jc w:val="both"/>
+              <w:rPr>
+                <w:rFonts w:ascii="Calibri" w:hAnsi="Calibri" w:cs="Arial"/>
+                <w:sz w:val="20"/>
+                <w:szCs w:val="20"/>
+                <w:lang w:eastAsia="es-CL"/>
+              </w:rPr>
+            </w:pPr>
+            <w:r>
+              <w:rPr>
+                <w:rFonts w:ascii="Calibri" w:hAnsi="Calibri" w:cs="Arial"/>
+                <w:sz w:val="20"/>
+                <w:szCs w:val="20"/>
+                <w:lang w:eastAsia="es-CL"/>
+              </w:rPr>
+              <w:t>Reemplazo del panel de tendencias de mercado por sugerencias de promoción calculadas sobre las ventas del local.</w:t>
+            </w:r>
+            <w:proofErr w:type="spellStart"/>
+            <w:r>
+              <w:rPr>
+                <w:rFonts w:ascii="Calibri" w:hAnsi="Calibri" w:cs="Arial"/>
+                <w:sz w:val="20"/>
+                <w:szCs w:val="20"/>
+                <w:lang w:eastAsia="es-CL"/>
+              </w:rPr>
+            </w:r>
+            <w:proofErr w:type="spellEnd"/>
+            <w:r>
+              <w:rPr>
+                <w:rFonts w:ascii="Calibri" w:hAnsi="Calibri" w:cs="Arial"/>
+                <w:sz w:val="20"/>
+                <w:szCs w:val="20"/>
+                <w:lang w:eastAsia="es-CL"/>
+              </w:rPr>
+            </w:r>
+          </w:p>
+        </w:tc>
+        <w:tc>
+          <w:tcPr>
+            <w:tcW w:w="1276" w:type="dxa"/>
+          </w:tcPr>
+          <w:p>
+            <w:pPr>
+              <w:jc w:val="both"/>
+              <w:rPr>
+                <w:rFonts w:ascii="Calibri" w:hAnsi="Calibri" w:cs="Arial"/>
+                <w:sz w:val="20"/>
+                <w:szCs w:val="20"/>
+                <w:lang w:eastAsia="es-CL"/>
+              </w:rPr>
+            </w:pPr>
+            <w:r>
+              <w:rPr>
+                <w:rFonts w:ascii="Calibri" w:hAnsi="Calibri" w:cs="Arial"/>
+                <w:sz w:val="20"/>
+                <w:szCs w:val="20"/>
+                <w:lang w:eastAsia="es-CL"/>
+              </w:rPr>
+              <w:t>Datos de venta y de vencimiento ya existentes en el sistema, React 19.</w:t>
+            </w:r>
+          </w:p>
+        </w:tc>
+        <w:tc>
+          <w:tcPr>
+            <w:tcW w:w="1276" w:type="dxa"/>
+          </w:tcPr>
+          <w:p>
+            <w:pPr>
+              <w:jc w:val="both"/>
+              <w:rPr>
+                <w:rFonts w:ascii="Calibri" w:hAnsi="Calibri" w:cs="Arial"/>
+                <w:sz w:val="20"/>
+                <w:szCs w:val="20"/>
+                <w:lang w:eastAsia="es-CL"/>
+              </w:rPr>
+            </w:pPr>
+            <w:r>
+              <w:rPr>
+                <w:rFonts w:ascii="Calibri" w:hAnsi="Calibri" w:cs="Arial"/>
+                <w:sz w:val="20"/>
+                <w:szCs w:val="20"/>
+                <w:lang w:eastAsia="es-CL"/>
+              </w:rPr>
+              <w:t>1 semana</w:t>
+            </w:r>
+          </w:p>
+        </w:tc>
+        <w:tc>
+          <w:tcPr>
+            <w:tcW w:w="1275" w:type="dxa"/>
+          </w:tcPr>
+          <w:p>
+            <w:pPr>
+              <w:jc w:val="both"/>
+              <w:rPr>
+                <w:rFonts w:ascii="Calibri" w:hAnsi="Calibri" w:cs="Arial"/>
+                <w:sz w:val="20"/>
+                <w:szCs w:val="20"/>
+                <w:lang w:eastAsia="es-CL"/>
+              </w:rPr>
+            </w:pPr>
+            <w:r>
+              <w:rPr>
+                <w:rFonts w:ascii="Calibri" w:hAnsi="Calibri" w:cs="Arial"/>
+                <w:sz w:val="20"/>
+                <w:szCs w:val="20"/>
+                <w:lang w:eastAsia="es-CL"/>
+              </w:rPr>
+              <w:t>David Miranda</w:t>
+            </w:r>
+          </w:p>
+        </w:tc>
+        <w:tc>
+          <w:tcPr>
+            <w:tcW w:w="1276" w:type="dxa"/>
+          </w:tcPr>
+          <w:p>
+            <w:pPr>
+              <w:jc w:val="both"/>
+              <w:rPr>
+                <w:rFonts w:ascii="Calibri" w:hAnsi="Calibri" w:cs="Arial"/>
+                <w:sz w:val="20"/>
+                <w:szCs w:val="20"/>
+                <w:lang w:eastAsia="es-CL"/>
+              </w:rPr>
+            </w:pPr>
+            <w:r>
+              <w:rPr>
+                <w:rFonts w:ascii="Calibri" w:hAnsi="Calibri" w:cs="Arial"/>
+                <w:sz w:val="20"/>
+                <w:szCs w:val="20"/>
+                <w:lang w:eastAsia="es-CL"/>
+              </w:rPr>
+              <w:t>Facilitador: la velocidad de venta y los días de inventario restante ya se calculan y ya llegan a la interfaz, de modo que no requiere trabajo de servidor. Dificultad: el panel anterior presentaba como referencia externa un valor que el propio sistema calculaba.</w:t>
+            </w:r>
+          </w:p>
+        </w:tc>
+        <w:tc>
+          <w:tcPr>
+            <w:tcW w:w="1418" w:type="dxa"/>
+          </w:tcPr>
+          <w:p>
+            <w:pPr>
+              <w:jc w:val="both"/>
+              <w:rPr>
+                <w:rFonts w:ascii="Calibri" w:hAnsi="Calibri" w:cs="Arial"/>
+                <w:sz w:val="20"/>
+                <w:szCs w:val="20"/>
+                <w:lang w:eastAsia="es-CL"/>
+              </w:rPr>
+            </w:pPr>
+            <w:r>
+              <w:rPr>
+                <w:rFonts w:ascii="Calibri" w:hAnsi="Calibri" w:cs="Arial"/>
+                <w:sz w:val="20"/>
+                <w:szCs w:val="20"/>
+                <w:lang w:eastAsia="es-CL"/>
+              </w:rPr>
+              <w:t>En curso</w:t>
+            </w:r>
+          </w:p>
+        </w:tc>
+        <w:tc>
+          <w:tcPr>
+            <w:tcW w:w="850" w:type="dxa"/>
+          </w:tcPr>
+          <w:p>
+            <w:pPr>
+              <w:jc w:val="both"/>
+              <w:rPr>
+                <w:rFonts w:ascii="Calibri" w:hAnsi="Calibri" w:cs="Arial"/>
+                <w:sz w:val="20"/>
+                <w:szCs w:val="20"/>
+                <w:lang w:eastAsia="es-CL"/>
+              </w:rPr>
+            </w:pPr>
+            <w:r>
+              <w:rPr>
+                <w:rFonts w:ascii="Calibri" w:hAnsi="Calibri" w:cs="Arial"/>
+                <w:sz w:val="20"/>
+                <w:szCs w:val="20"/>
+                <w:lang w:eastAsia="es-CL"/>
+              </w:rPr>
+              <w:t>Decisión del equipo del 19 de octubre. No es una pantalla nueva: el mismo espacio pasa a mostrar dos reglas verificables sobre datos propios, qué conviene promocionar por rotación y qué conviene liquidar por vencimiento próximo. Se eliminan los proveedores simulados y la comparación de precio contra un mercado externo que el sistema no consulta.</w:t>
+            </w:r>
+          </w:p>
+        </w:tc>
+      </w:tr>
+      <w:tr>
+        <w:tc>
+          <w:tcPr>
+            <w:tcW w:w="1328" w:type="dxa"/>
+          </w:tcPr>
+          <w:p>
+            <w:pPr>
+              <w:jc w:val="both"/>
+              <w:rPr>
+                <w:rFonts w:ascii="Calibri" w:hAnsi="Calibri" w:cs="Arial"/>
+                <w:sz w:val="20"/>
+                <w:szCs w:val="20"/>
+                <w:lang w:eastAsia="es-CL"/>
+              </w:rPr>
+            </w:pPr>
+            <w:r>
+              <w:rPr>
+                <w:rFonts w:ascii="Calibri" w:hAnsi="Calibri" w:cs="Arial"/>
+                <w:sz w:val="20"/>
+                <w:szCs w:val="20"/>
+                <w:lang w:eastAsia="es-CL"/>
+              </w:rPr>
+              <w:t>Construir modelos de datos para soportar los requerimientos de la organización.</w:t>
+            </w:r>
+          </w:p>
+        </w:tc>
+        <w:tc>
+          <w:tcPr>
+            <w:tcW w:w="1077" w:type="dxa"/>
+          </w:tcPr>
+          <w:p>
+            <w:pPr>
+              <w:jc w:val="both"/>
+              <w:rPr>
+                <w:rFonts w:ascii="Calibri" w:hAnsi="Calibri" w:cs="Arial"/>
+                <w:sz w:val="20"/>
+                <w:szCs w:val="20"/>
+                <w:lang w:eastAsia="es-CL"/>
+              </w:rPr>
+            </w:pPr>
+            <w:r>
+              <w:rPr>
+                <w:rFonts w:ascii="Calibri" w:hAnsi="Calibri" w:cs="Arial"/>
+                <w:sz w:val="20"/>
+                <w:szCs w:val="20"/>
+                <w:lang w:eastAsia="es-CL"/>
+              </w:rPr>
+              <w:t>Análisis de productos que se venden juntos para recomendar promociones combinadas.</w:t>
+            </w:r>
+            <w:proofErr w:type="spellStart"/>
+            <w:r>
+              <w:rPr>
+                <w:rFonts w:ascii="Calibri" w:hAnsi="Calibri" w:cs="Arial"/>
+                <w:sz w:val="20"/>
+                <w:szCs w:val="20"/>
+                <w:lang w:eastAsia="es-CL"/>
+              </w:rPr>
+            </w:r>
+            <w:proofErr w:type="spellEnd"/>
+            <w:r>
+              <w:rPr>
+                <w:rFonts w:ascii="Calibri" w:hAnsi="Calibri" w:cs="Arial"/>
+                <w:sz w:val="20"/>
+                <w:szCs w:val="20"/>
+                <w:lang w:eastAsia="es-CL"/>
+              </w:rPr>
+            </w:r>
+          </w:p>
+        </w:tc>
+        <w:tc>
+          <w:tcPr>
+            <w:tcW w:w="1276" w:type="dxa"/>
+          </w:tcPr>
+          <w:p>
+            <w:pPr>
+              <w:jc w:val="both"/>
+              <w:rPr>
+                <w:rFonts w:ascii="Calibri" w:hAnsi="Calibri" w:cs="Arial"/>
+                <w:sz w:val="20"/>
+                <w:szCs w:val="20"/>
+                <w:lang w:eastAsia="es-CL"/>
+              </w:rPr>
+            </w:pPr>
+            <w:r>
+              <w:rPr>
+                <w:rFonts w:ascii="Calibri" w:hAnsi="Calibri" w:cs="Arial"/>
+                <w:sz w:val="20"/>
+                <w:szCs w:val="20"/>
+                <w:lang w:eastAsia="es-CL"/>
+              </w:rPr>
+              <w:t>Historial de ventas del local, consultas de coocurrencia sobre el detalle de venta.</w:t>
+            </w:r>
+          </w:p>
+        </w:tc>
+        <w:tc>
+          <w:tcPr>
+            <w:tcW w:w="1276" w:type="dxa"/>
+          </w:tcPr>
+          <w:p>
+            <w:pPr>
+              <w:jc w:val="both"/>
+              <w:rPr>
+                <w:rFonts w:ascii="Calibri" w:hAnsi="Calibri" w:cs="Arial"/>
+                <w:sz w:val="20"/>
+                <w:szCs w:val="20"/>
+                <w:lang w:eastAsia="es-CL"/>
+              </w:rPr>
+            </w:pPr>
+            <w:r>
+              <w:rPr>
+                <w:rFonts w:ascii="Calibri" w:hAnsi="Calibri" w:cs="Arial"/>
+                <w:sz w:val="20"/>
+                <w:szCs w:val="20"/>
+                <w:lang w:eastAsia="es-CL"/>
+              </w:rPr>
+              <w:t>2 semanas</w:t>
+            </w:r>
+          </w:p>
+        </w:tc>
+        <w:tc>
+          <w:tcPr>
+            <w:tcW w:w="1275" w:type="dxa"/>
+          </w:tcPr>
+          <w:p>
+            <w:pPr>
+              <w:jc w:val="both"/>
+              <w:rPr>
+                <w:rFonts w:ascii="Calibri" w:hAnsi="Calibri" w:cs="Arial"/>
+                <w:sz w:val="20"/>
+                <w:szCs w:val="20"/>
+                <w:lang w:eastAsia="es-CL"/>
+              </w:rPr>
+            </w:pPr>
+            <w:r>
+              <w:rPr>
+                <w:rFonts w:ascii="Calibri" w:hAnsi="Calibri" w:cs="Arial"/>
+                <w:sz w:val="20"/>
+                <w:szCs w:val="20"/>
+                <w:lang w:eastAsia="es-CL"/>
+              </w:rPr>
+              <w:t>Marcelo Pino</w:t>
+            </w:r>
+          </w:p>
+        </w:tc>
+        <w:tc>
+          <w:tcPr>
+            <w:tcW w:w="1276" w:type="dxa"/>
+          </w:tcPr>
+          <w:p>
+            <w:pPr>
+              <w:jc w:val="both"/>
+              <w:rPr>
+                <w:rFonts w:ascii="Calibri" w:hAnsi="Calibri" w:cs="Arial"/>
+                <w:sz w:val="20"/>
+                <w:szCs w:val="20"/>
+                <w:lang w:eastAsia="es-CL"/>
+              </w:rPr>
+            </w:pPr>
+            <w:r>
+              <w:rPr>
+                <w:rFonts w:ascii="Calibri" w:hAnsi="Calibri" w:cs="Arial"/>
+                <w:sz w:val="20"/>
+                <w:szCs w:val="20"/>
+                <w:lang w:eastAsia="es-CL"/>
+              </w:rPr>
+              <w:t>Dificultad: el cálculo requiere un volumen de ventas reales que el sistema todavía no acumula. Medido sobre la base de datos de la nube: de 459 ventas registradas, 39 incluyen dos o más productos y ningún par de productos se repite más de una vez.</w:t>
+            </w:r>
+          </w:p>
+        </w:tc>
+        <w:tc>
+          <w:tcPr>
+            <w:tcW w:w="1418" w:type="dxa"/>
+          </w:tcPr>
+          <w:p>
+            <w:pPr>
+              <w:jc w:val="both"/>
+              <w:rPr>
+                <w:rFonts w:ascii="Calibri" w:hAnsi="Calibri" w:cs="Arial"/>
+                <w:sz w:val="20"/>
+                <w:szCs w:val="20"/>
+                <w:lang w:eastAsia="es-CL"/>
+              </w:rPr>
+            </w:pPr>
+            <w:r>
+              <w:rPr>
+                <w:rFonts w:ascii="Calibri" w:hAnsi="Calibri" w:cs="Arial"/>
+                <w:sz w:val="20"/>
+                <w:szCs w:val="20"/>
+                <w:lang w:eastAsia="es-CL"/>
+              </w:rPr>
+              <w:t>No iniciado</w:t>
+            </w:r>
+          </w:p>
+        </w:tc>
+        <w:tc>
+          <w:tcPr>
+            <w:tcW w:w="850" w:type="dxa"/>
+          </w:tcPr>
+          <w:p>
+            <w:pPr>
+              <w:jc w:val="both"/>
+              <w:rPr>
+                <w:rFonts w:ascii="Calibri" w:hAnsi="Calibri" w:cs="Arial"/>
+                <w:sz w:val="20"/>
+                <w:szCs w:val="20"/>
+                <w:lang w:eastAsia="es-CL"/>
+              </w:rPr>
+            </w:pPr>
+            <w:r>
+              <w:rPr>
+                <w:rFonts w:ascii="Calibri" w:hAnsi="Calibri" w:cs="Arial"/>
+                <w:sz w:val="20"/>
+                <w:szCs w:val="20"/>
+                <w:lang w:eastAsia="es-CL"/>
+              </w:rPr>
+              <w:t>Programada para la Fase 3, después de la prueba con usuarios en un local real, que es la actividad que aporta el historial necesario. Se declara con la medición que la fundamenta y no como una actividad pendiente sin explicación.</w:t>
+            </w:r>
+          </w:p>
+        </w:tc>
+      </w:tr>
+      <w:tr>
+        <w:tc>
+          <w:tcPr>
+            <w:tcW w:w="1328" w:type="dxa"/>
+          </w:tcPr>
+          <w:p>
+            <w:pPr>
+              <w:jc w:val="both"/>
+              <w:rPr>
+                <w:rFonts w:ascii="Calibri" w:hAnsi="Calibri" w:cs="Arial"/>
+                <w:sz w:val="20"/>
+                <w:szCs w:val="20"/>
+                <w:lang w:eastAsia="es-CL"/>
+              </w:rPr>
+            </w:pPr>
+            <w:r>
+              <w:rPr>
+                <w:rFonts w:ascii="Calibri" w:hAnsi="Calibri" w:cs="Arial"/>
+                <w:sz w:val="20"/>
+                <w:szCs w:val="20"/>
+                <w:lang w:eastAsia="es-CL"/>
+              </w:rPr>
+              <w:t>Construir modelos de datos para soportar los requerimientos de la organización.</w:t>
+            </w:r>
+          </w:p>
+        </w:tc>
+        <w:tc>
+          <w:tcPr>
+            <w:tcW w:w="1077" w:type="dxa"/>
+          </w:tcPr>
+          <w:p>
+            <w:pPr>
+              <w:jc w:val="both"/>
+              <w:rPr>
+                <w:rFonts w:ascii="Calibri" w:hAnsi="Calibri" w:cs="Arial"/>
+                <w:sz w:val="20"/>
+                <w:szCs w:val="20"/>
+                <w:lang w:eastAsia="es-CL"/>
+              </w:rPr>
+            </w:pPr>
+            <w:r>
+              <w:rPr>
+                <w:rFonts w:ascii="Calibri" w:hAnsi="Calibri" w:cs="Arial"/>
+                <w:sz w:val="20"/>
+                <w:szCs w:val="20"/>
+                <w:lang w:eastAsia="es-CL"/>
+              </w:rPr>
+              <w:t>Existencia por lote y consumo del vencimiento más próximo (FEFO).</w:t>
+            </w:r>
+            <w:proofErr w:type="spellStart"/>
+            <w:r>
+              <w:rPr>
+                <w:rFonts w:ascii="Calibri" w:hAnsi="Calibri" w:cs="Arial"/>
+                <w:sz w:val="20"/>
+                <w:szCs w:val="20"/>
+                <w:lang w:eastAsia="es-CL"/>
+              </w:rPr>
+            </w:r>
+            <w:proofErr w:type="spellEnd"/>
+            <w:r>
+              <w:rPr>
+                <w:rFonts w:ascii="Calibri" w:hAnsi="Calibri" w:cs="Arial"/>
+                <w:sz w:val="20"/>
+                <w:szCs w:val="20"/>
+                <w:lang w:eastAsia="es-CL"/>
+              </w:rPr>
+            </w:r>
+          </w:p>
+        </w:tc>
+        <w:tc>
+          <w:tcPr>
+            <w:tcW w:w="1276" w:type="dxa"/>
+          </w:tcPr>
+          <w:p>
+            <w:pPr>
+              <w:jc w:val="both"/>
+              <w:rPr>
+                <w:rFonts w:ascii="Calibri" w:hAnsi="Calibri" w:cs="Arial"/>
+                <w:sz w:val="20"/>
+                <w:szCs w:val="20"/>
+                <w:lang w:eastAsia="es-CL"/>
+              </w:rPr>
+            </w:pPr>
+            <w:r>
+              <w:rPr>
+                <w:rFonts w:ascii="Calibri" w:hAnsi="Calibri" w:cs="Arial"/>
+                <w:sz w:val="20"/>
+                <w:szCs w:val="20"/>
+                <w:lang w:eastAsia="es-CL"/>
+              </w:rPr>
+              <w:t>PostgreSQL 16, SQLite 3, migraciones versionadas.</w:t>
+            </w:r>
+          </w:p>
+        </w:tc>
+        <w:tc>
+          <w:tcPr>
+            <w:tcW w:w="1276" w:type="dxa"/>
+          </w:tcPr>
+          <w:p>
+            <w:pPr>
+              <w:jc w:val="both"/>
+              <w:rPr>
+                <w:rFonts w:ascii="Calibri" w:hAnsi="Calibri" w:cs="Arial"/>
+                <w:sz w:val="20"/>
+                <w:szCs w:val="20"/>
+                <w:lang w:eastAsia="es-CL"/>
+              </w:rPr>
+            </w:pPr>
+            <w:r>
+              <w:rPr>
+                <w:rFonts w:ascii="Calibri" w:hAnsi="Calibri" w:cs="Arial"/>
+                <w:sz w:val="20"/>
+                <w:szCs w:val="20"/>
+                <w:lang w:eastAsia="es-CL"/>
+              </w:rPr>
+              <w:t>1 semana</w:t>
+            </w:r>
+          </w:p>
+        </w:tc>
+        <w:tc>
+          <w:tcPr>
+            <w:tcW w:w="1275" w:type="dxa"/>
+          </w:tcPr>
+          <w:p>
+            <w:pPr>
+              <w:jc w:val="both"/>
+              <w:rPr>
+                <w:rFonts w:ascii="Calibri" w:hAnsi="Calibri" w:cs="Arial"/>
+                <w:sz w:val="20"/>
+                <w:szCs w:val="20"/>
+                <w:lang w:eastAsia="es-CL"/>
+              </w:rPr>
+            </w:pPr>
+            <w:r>
+              <w:rPr>
+                <w:rFonts w:ascii="Calibri" w:hAnsi="Calibri" w:cs="Arial"/>
+                <w:sz w:val="20"/>
+                <w:szCs w:val="20"/>
+                <w:lang w:eastAsia="es-CL"/>
+              </w:rPr>
+              <w:t>Marcelo Pino</w:t>
+            </w:r>
+          </w:p>
+        </w:tc>
+        <w:tc>
+          <w:tcPr>
+            <w:tcW w:w="1276" w:type="dxa"/>
+          </w:tcPr>
+          <w:p>
+            <w:pPr>
+              <w:jc w:val="both"/>
+              <w:rPr>
+                <w:rFonts w:ascii="Calibri" w:hAnsi="Calibri" w:cs="Arial"/>
+                <w:sz w:val="20"/>
+                <w:szCs w:val="20"/>
+                <w:lang w:eastAsia="es-CL"/>
+              </w:rPr>
+            </w:pPr>
+            <w:r>
+              <w:rPr>
+                <w:rFonts w:ascii="Calibri" w:hAnsi="Calibri" w:cs="Arial"/>
+                <w:sz w:val="20"/>
+                <w:szCs w:val="20"/>
+                <w:lang w:eastAsia="es-CL"/>
+              </w:rPr>
+              <w:t>Dificultad: el vencimiento era un único campo por producto, de modo que una reposición solo podía conservar una de las dos fechas en juego y el sistema no sabía cuántas unidades vencían en cada una. Facilitador: el modelo de datos ya contemplaba migraciones versionadas, lo que permitió incorporar la tabla sin recrear el esquema ni perder información.</w:t>
+            </w:r>
+          </w:p>
+        </w:tc>
+        <w:tc>
+          <w:tcPr>
+            <w:tcW w:w="1418" w:type="dxa"/>
+          </w:tcPr>
+          <w:p>
+            <w:pPr>
+              <w:jc w:val="both"/>
+              <w:rPr>
+                <w:rFonts w:ascii="Calibri" w:hAnsi="Calibri" w:cs="Arial"/>
+                <w:sz w:val="20"/>
+                <w:szCs w:val="20"/>
+                <w:lang w:eastAsia="es-CL"/>
+              </w:rPr>
+            </w:pPr>
+            <w:r>
+              <w:rPr>
+                <w:rFonts w:ascii="Calibri" w:hAnsi="Calibri" w:cs="Arial"/>
+                <w:sz w:val="20"/>
+                <w:szCs w:val="20"/>
+                <w:lang w:eastAsia="es-CL"/>
+              </w:rPr>
+              <w:t>Completado</w:t>
+            </w:r>
+          </w:p>
+        </w:tc>
+        <w:tc>
+          <w:tcPr>
+            <w:tcW w:w="850" w:type="dxa"/>
+          </w:tcPr>
+          <w:p>
+            <w:pPr>
+              <w:jc w:val="both"/>
+              <w:rPr>
+                <w:rFonts w:ascii="Calibri" w:hAnsi="Calibri" w:cs="Arial"/>
+                <w:sz w:val="20"/>
+                <w:szCs w:val="20"/>
+                <w:lang w:eastAsia="es-CL"/>
+              </w:rPr>
+            </w:pPr>
+            <w:r>
+              <w:rPr>
+                <w:rFonts w:ascii="Calibri" w:hAnsi="Calibri" w:cs="Arial"/>
+                <w:sz w:val="20"/>
+                <w:szCs w:val="20"/>
+                <w:lang w:eastAsia="es-CL"/>
+              </w:rPr>
+              <w:t>El vencimiento pasó a llevarse por lote. La venta, la merma y la sincronización descuentan primero lo que vence antes. El estado existente se traspasó asignando a cada producto con fecha un lote inicial, aproximación que se declara porque el detalle anterior no quedó registrado; desde la migración en adelante cada compra entra con su propio lote.</w:t>
             </w:r>
           </w:p>
         </w:tc>
@@ -5638,6 +6315,50 @@
               <w:t>ni la integración con sistemas contables de terceros, que son requisitos de cadenas grandes y no de un local de barrio.</w:t>
             </w:r>
           </w:p>
+          <w:p>
+            <w:pPr>
+              <w:jc w:val="both"/>
+              <w:rPr>
+                <w:rFonts w:ascii="Calibri" w:hAnsi="Calibri" w:cs="Arial"/>
+                <w:b/>
+                <w:sz w:val="20"/>
+                <w:szCs w:val="20"/>
+                <w:lang w:eastAsia="es-CL"/>
+              </w:rPr>
+            </w:pPr>
+            <w:r>
+              <w:rPr>
+                <w:rFonts w:ascii="Calibri" w:hAnsi="Calibri" w:cs="Arial"/>
+                <w:b/>
+                <w:sz w:val="20"/>
+                <w:szCs w:val="20"/>
+                <w:lang w:eastAsia="es-CL"/>
+              </w:rPr>
+              <w:t>Sexta dificultad: una prueba que fallaba de forma intermitente y no se podía reproducir. El ayudante de pruebas, al solicitársele la base de datos de la nube, comprobaba su disponibilidad con medio segundo de margen y, si no alcanzaba a responder, continuaba sobre el motor en memoria sin avisar. Como cada conjunto de pruebas consulta por separado, uno solo podía ejecutarse sobre un motor distinto al del resto de la corrida sin dejar rastro. Allí se ocultó durante dos ejecuciones una sentencia válida en el motor de la nube que el motor en memoria no implementa: el conjunto que se degradaba fallaba, los demás aprobaban, y el resultado parecía aleatorio. Acción adoptada: si se solicita el motor real y no responde, la corrida se detiene indicando el motivo, en vez de continuar sobre otro motor, porque eso haría pasar por verificado contra la nube algo que no lo está. La sentencia se reemplazó por una equivalente que ambos motores admiten, y la batería se ejecuta desde entonces contra los dos.</w:t>
+            </w:r>
+          </w:p>
+          <w:p>
+            <w:pPr>
+              <w:jc w:val="both"/>
+              <w:rPr>
+                <w:rFonts w:ascii="Calibri" w:hAnsi="Calibri" w:cs="Arial"/>
+                <w:b/>
+                <w:sz w:val="20"/>
+                <w:szCs w:val="20"/>
+                <w:lang w:eastAsia="es-CL"/>
+              </w:rPr>
+            </w:pPr>
+            <w:r>
+              <w:rPr>
+                <w:rFonts w:ascii="Calibri" w:hAnsi="Calibri" w:cs="Arial"/>
+                <w:b/>
+                <w:sz w:val="20"/>
+                <w:szCs w:val="20"/>
+                <w:lang w:eastAsia="es-CL"/>
+              </w:rPr>
+              <w:t>Séptima dificultad: una prueba de ingesta aprobaba en el equipo de un integrante y fallaba en el del otro sobre idéntico código, por una aserción de tiempo de respuesta. Un resultado de cien por ciento aprobado que depende del computador no constituye evidencia, y habría fallado ante quien estuviera revisando. Acción adoptada: la medición de tiempo se separó de la aserción. La referencia de desempeño sigue declarada y se informa cuando la corrida la supera, pero lo que se exige es un tope de regresión deliberadamente alto, que no mide desempeño sino que detecta una operación colgada. Fueron ocho aserciones, con topes entre cincuenta y quinientos milisegundos.</w:t>
+            </w:r>
+          </w:p>
         </w:tc>
       </w:tr>
     </w:tbl>
@@ -5853,6 +6574,94 @@
                 <w:lang w:eastAsia="es-CL"/>
               </w:rPr>
               <w:t>El resto del plan de trabajo no requirió ajustes. Esto se explica por dos facilitadores ya descritos: la división por especialidad, que evitó dependencias bloqueantes entre los integrantes, y la verificación automatizada, que acotó el retrabajo al detectar los defectos dentro de la misma iteración en que se introducían.</w:t>
+            </w:r>
+          </w:p>
+          <w:p>
+            <w:pPr>
+              <w:jc w:val="both"/>
+              <w:rPr>
+                <w:rFonts w:ascii="Calibri" w:hAnsi="Calibri" w:cs="Arial"/>
+                <w:b/>
+                <w:sz w:val="20"/>
+                <w:szCs w:val="20"/>
+                <w:lang w:eastAsia="es-CL"/>
+              </w:rPr>
+            </w:pPr>
+            <w:r>
+              <w:rPr>
+                <w:rFonts w:ascii="Calibri" w:hAnsi="Calibri" w:cs="Arial"/>
+                <w:b/>
+                <w:sz w:val="20"/>
+                <w:szCs w:val="20"/>
+                <w:lang w:eastAsia="es-CL"/>
+              </w:rPr>
+              <w:t>Actividad eliminada: tendencias de mercado obtenidas de servicios externos. Estaba construida y se retiró tras verificar que ningún proveedor consultaba internet: los indicadores se derivaban del largo del nombre del producto, de modo que el panel informaba al dueño del local una diferencia de precio contra un mercado que nunca se consultó. Obtener esos datos exige una aplicación registrada y un proceso de autorización ante cada servicio, cuyo plazo no depende del equipo.</w:t>
+            </w:r>
+          </w:p>
+          <w:p>
+            <w:pPr>
+              <w:jc w:val="both"/>
+              <w:rPr>
+                <w:rFonts w:ascii="Calibri" w:hAnsi="Calibri" w:cs="Arial"/>
+                <w:b/>
+                <w:sz w:val="20"/>
+                <w:szCs w:val="20"/>
+                <w:lang w:eastAsia="es-CL"/>
+              </w:rPr>
+            </w:pPr>
+            <w:r>
+              <w:rPr>
+                <w:rFonts w:ascii="Calibri" w:hAnsi="Calibri" w:cs="Arial"/>
+                <w:b/>
+                <w:sz w:val="20"/>
+                <w:szCs w:val="20"/>
+                <w:lang w:eastAsia="es-CL"/>
+              </w:rPr>
+              <w:t>Actividad incorporada en su reemplazo: sugerencias de promoción sobre datos propios. Ocupa el mismo espacio de la interfaz y aplica dos reglas verificables sobre información que el sistema ya calcula: productos de rotación alta con poco stock disponible, y productos con vencimiento próximo y stock por liquidar. No incorpora una pantalla nueva ni amplía el alcance comprometido; sustituye un dato inventado por uno medido.</w:t>
+            </w:r>
+          </w:p>
+          <w:p>
+            <w:pPr>
+              <w:jc w:val="both"/>
+              <w:rPr>
+                <w:rFonts w:ascii="Calibri" w:hAnsi="Calibri" w:cs="Arial"/>
+                <w:b/>
+                <w:sz w:val="20"/>
+                <w:szCs w:val="20"/>
+                <w:lang w:eastAsia="es-CL"/>
+              </w:rPr>
+            </w:pPr>
+            <w:r>
+              <w:rPr>
+                <w:rFonts w:ascii="Calibri" w:hAnsi="Calibri" w:cs="Arial"/>
+                <w:b/>
+                <w:sz w:val="20"/>
+                <w:szCs w:val="20"/>
+                <w:lang w:eastAsia="es-CL"/>
+              </w:rPr>
+              <w:t>La tercera regla prevista, recomendar promociones combinando productos que suelen venderse juntos, se traslada a la Fase 3 por falta de historial, con la medición que lo justifica indicada en el plan de trabajo. El equipo prefirió declararlo así y no presentar una recomendación que hoy no tendría ningún respaldo estadístico.</w:t>
+            </w:r>
+          </w:p>
+          <w:p>
+            <w:pPr>
+              <w:jc w:val="both"/>
+              <w:rPr>
+                <w:rFonts w:ascii="Calibri" w:hAnsi="Calibri" w:cs="Arial"/>
+                <w:b/>
+                <w:sz w:val="20"/>
+                <w:szCs w:val="20"/>
+                <w:lang w:eastAsia="es-CL"/>
+              </w:rPr>
+            </w:pPr>
+            <w:r>
+              <w:rPr>
+                <w:rFonts w:ascii="Calibri" w:hAnsi="Calibri" w:cs="Arial"/>
+                <w:b/>
+                <w:sz w:val="20"/>
+                <w:szCs w:val="20"/>
+                <w:lang w:eastAsia="es-CL"/>
+              </w:rPr>
+              <w:t>Actividad incorporada: existencia por lote para el control de vencimientos. No estaba planificada como actividad propia. Se incorporó al advertir que el sistema registraba una sola fecha de vencimiento por producto, de modo que al reponer mercadería la fecha del lote entrante reemplazaba a la anterior y las unidades que vencían antes desaparecían de la alerta. No amplía el alcance comprometido: el control de vencimientos por el método FEFO ya estaba declarado como requisito normativo, y esta actividad es lo que lo hace efectivo. El criterio que la gobierna es que la existencia del producto es la fuente de verdad y el lote es una capa contable sobre ella, de modo que una discrepancia entre ambos nunca impide registrar una venta.</w:t>
             </w:r>
           </w:p>
         </w:tc>
@@ -5956,7 +6765,7 @@
                 <w:szCs w:val="20"/>
                 <w:lang w:eastAsia="es-CL"/>
               </w:rPr>
-              <w:t>Actividad no iniciada: empaquetado del terminal como instalador de escritorio. No se ha iniciado porque depende de que la interfaz de usuario esté estabilizada; empaquetar una interfaz que aún cambia obligaría a rehacer el trabajo. No compromete el proyecto, ya que la aplicación funciona hoy en navegador y el empaquetado no modifica la lógica del sistema. Estrategia: se ejecutará al inicio de la Fase 3, una vez cerrada la interfaz, y se reservaron dos semanas para ello.</w:t>
+              <w:t>Actividad no iniciada: empaquetado del terminal como instalador de escritorio. La toma Marcelo Pino. No se ha iniciado porque estaba pendiente de verificar que el cliente de base de datos local funcionara dentro del entorno de escritorio, condición que de no cumplirse habría obligado a reemplazarlo y a rehacer las migraciones. La verificación se realizó el 19 de octubre y el resultado fue favorable, de modo que la actividad queda habilitada para iniciarse. No compromete el proyecto, ya que la aplicación funciona hoy en navegador y el empaquetado no modifica la lógica del sistema. Se descartó además la necesidad de congelar la interfaz: el empaquetado toma la aplicación ya construida, por lo que ambos integrantes pueden avanzar en paralelo.</w:t>
             </w:r>
           </w:p>
           <w:p>

</xml_diff>

<commit_message>
Actualizar el informe de avance con la cobertura medida y la batería de extremo a extremo al día
</commit_message>
<xml_diff>
--- a/FASE 2/Evidencias Grupales/2.4_Guía Estudiante_Fase 2_Desarrollo Proyecto APT.docx
+++ b/FASE 2/Evidencias Grupales/2.4_Guía Estudiante_Fase 2_Desarrollo Proyecto APT.docx
@@ -1408,7 +1408,7 @@
                 <w:szCs w:val="20"/>
                 <w:lang w:eastAsia="es-CL"/>
               </w:rPr>
-              <w:t>Evidencia 4. Batería de pruebas automatizadas. Sobre el servidor, 210 pruebas unitarias repartidas en dieciséis conjuntos y 87 pruebas de integración en dieciséis conjuntos, que en conjunto ejercitan las 72 rutas de la interfaz de programación, sin dejar ninguna sin cubrir. Sobre la interfaz, 18 pruebas unitarias de sus reglas de negocio y 11 pruebas del contrato que la une al servidor. Sobre el sistema en ejecución, 92 comprobaciones de extremo a extremo, con reporte fechado por cada corrida. La batería se ejecuta contra los dos motores de base de datos, el de la nube y el del terminal, porque una sentencia válida en uno puede no estarlo en el otro. Evidencia el diseño y la aplicación de pruebas de validación del producto.</w:t>
+              <w:t>Evidencia 4. Batería de pruebas automatizadas. Sobre el servidor, 210 pruebas unitarias repartidas en dieciséis conjuntos y 87 pruebas de integración en dieciséis conjuntos, que en conjunto ejercitan las 72 rutas de la interfaz de programación, sin dejar ninguna sin cubrir. Sobre la interfaz, 26 pruebas unitarias de sus reglas de negocio y 11 pruebas del contrato que la une al servidor. Sobre el sistema en ejecución, 109 comprobaciones de extremo a extremo, con reporte fechado por cada corrida; la última, del 20 de octubre de 2026, no registra fallas. La batería se ejecuta contra los dos motores de base de datos, el de la nube y el del terminal, porque una sentencia válida en uno puede no estarlo en el otro. La cobertura del servidor, medida sobre ambas baterías, alcanza el 78,7 % de las sentencias, y supera el 85 % en los módulos de reglas de negocio. Evidencia el diseño y la aplicación de pruebas de validación del producto.</w:t>
             </w:r>
             <w:r>
               <w:rPr>
@@ -1676,27 +1676,27 @@
                 <w:szCs w:val="20"/>
                 <w:lang w:eastAsia="es-CL"/>
               </w:rPr>
-              <w:t>Marcelo Pino. Servidor, modelo de datos y migraciones, cumplimiento normativo, contenedorización y pruebas unitarias y de integración. Registra 51 confirmaciones de cambios en el repositorio de título y 43 en el repositorio de trabajo, con 42.890 líneas aportadas. Su huella se concentra en 191 modificaciones sobre la carpeta del servidor, 177 sobre la documentación técnica y 39 sobre los conjuntos de pruebas unitarias.</w:t>
-            </w:r>
-          </w:p>
-          <w:p>
-            <w:pPr>
-              <w:jc w:val="both"/>
-              <w:rPr>
-                <w:rFonts w:ascii="Calibri" w:hAnsi="Calibri" w:cs="Arial"/>
-                <w:sz w:val="20"/>
-                <w:szCs w:val="20"/>
-                <w:lang w:eastAsia="es-CL"/>
-              </w:rPr>
-            </w:pPr>
-            <w:r>
-              <w:rPr>
-                <w:rFonts w:ascii="Calibri" w:hAnsi="Calibri" w:cs="Arial"/>
-                <w:sz w:val="20"/>
-                <w:szCs w:val="20"/>
-                <w:lang w:eastAsia="es-CL"/>
-              </w:rPr>
-              <w:t>David Miranda. Interfaz de usuario en sus dos modos de uso, batería de pruebas de extremo a extremo y verificación funcional del sistema en ejecución. Registra 50 confirmaciones de cambios en el repositorio de título y 14 en el repositorio de trabajo, con 57.766 líneas aportadas. Su huella se concentra en 410 modificaciones sobre la carpeta de la interfaz y sobre la batería de extremo a extremo.</w:t>
+              <w:t>Marcelo Pino. Servidor, modelo de datos y migraciones, cumplimiento normativo, contenedorización y pruebas unitarias y de integración. Registra 62 confirmaciones de cambios en el repositorio de título y 58 en el repositorio de trabajo, con 44.187 líneas aportadas. Su huella se concentra en las carpetas del servidor, de la documentación técnica y de los conjuntos de pruebas unitarias.</w:t>
+            </w:r>
+          </w:p>
+          <w:p>
+            <w:pPr>
+              <w:jc w:val="both"/>
+              <w:rPr>
+                <w:rFonts w:ascii="Calibri" w:hAnsi="Calibri" w:cs="Arial"/>
+                <w:sz w:val="20"/>
+                <w:szCs w:val="20"/>
+                <w:lang w:eastAsia="es-CL"/>
+              </w:rPr>
+            </w:pPr>
+            <w:r>
+              <w:rPr>
+                <w:rFonts w:ascii="Calibri" w:hAnsi="Calibri" w:cs="Arial"/>
+                <w:sz w:val="20"/>
+                <w:szCs w:val="20"/>
+                <w:lang w:eastAsia="es-CL"/>
+              </w:rPr>
+              <w:t>David Miranda. Interfaz de usuario en sus dos modos de uso, batería de pruebas de extremo a extremo y verificación funcional del sistema en ejecución. Registra 58 confirmaciones de cambios en el repositorio de título y 19 en el repositorio de trabajo, con 58.260 líneas aportadas. Su huella se concentra en la carpeta de la interfaz y en la batería de extremo a extremo.</w:t>
             </w:r>
           </w:p>
           <w:p>

</xml_diff>

<commit_message>
Corregir la cifra de pruebas de interfaz, el recuento de confirmaciones y el criterio de aporte en el informe
</commit_message>
<xml_diff>
--- a/FASE 2/Evidencias Grupales/2.4_Guía Estudiante_Fase 2_Desarrollo Proyecto APT.docx
+++ b/FASE 2/Evidencias Grupales/2.4_Guía Estudiante_Fase 2_Desarrollo Proyecto APT.docx
@@ -1325,7 +1325,7 @@
                 <w:szCs w:val="20"/>
                 <w:lang w:eastAsia="es-CL"/>
               </w:rPr>
-              <w:t>Evidencia 1. Repositorio Git del proyecto de título, con historial por integrante. Contiene 120 confirmaciones de cambios entre el 28 de agosto y el 20 de octubre de 2026, de las cuales 62 corresponden a Marcelo Pino y 58 a David Miranda, organizadas en la estructura de carpetas por fase y tipo de evidencia que exige la asignatura, con los nombres de archivo en el formato solicitado. El desarrollo diario se versiona además en el repositorio de trabajo del equipo, cuyos avances se incorporan al repositorio de título como evidencia de sistema. La totalidad de las evidencias descritas en este informe se encuentra confirmada en el repositorio remoto, de modo que su autoría y su fecha son verificables sin recurrir a archivos locales.</w:t>
+              <w:t>Evidencia 1. Repositorio Git del proyecto de título, con historial por integrante. Contiene 127 confirmaciones de cambios entre el 28 de agosto y el 20 de octubre de 2026, de las cuales 67 corresponden a Marcelo Pino y 60 a David Miranda. Las de Marcelo Pino figuran bajo dos identificadores: 66 con su cuenta institucional y una, de la documentación de la Fase 1, con un correo personal registrado al inicio del proyecto. Las evidencias se organizan en la estructura de carpetas por fase y tipo que exige la asignatura, con los nombres de archivo en el formato solicitado. El desarrollo diario se versiona además en el repositorio de trabajo del equipo, cuyos avances se incorporan al repositorio de título como evidencia de sistema. La totalidad de las evidencias descritas en este informe se encuentra confirmada en el repositorio remoto.</w:t>
             </w:r>
             <w:r>
               <w:rPr>
@@ -1676,56 +1676,55 @@
                 <w:szCs w:val="20"/>
                 <w:lang w:eastAsia="es-CL"/>
               </w:rPr>
-              <w:t>Marcelo Pino. Servidor, modelo de datos y migraciones, cumplimiento normativo, contenedorización y pruebas unitarias y de integración. Registra 62 confirmaciones de cambios en el repositorio de título y 58 en el repositorio de trabajo, con 44.187 líneas aportadas. Su huella se concentra en las carpetas del servidor, de la documentación técnica y de los conjuntos de pruebas unitarias.</w:t>
-            </w:r>
-          </w:p>
-          <w:p>
-            <w:pPr>
-              <w:jc w:val="both"/>
-              <w:rPr>
-                <w:rFonts w:ascii="Calibri" w:hAnsi="Calibri" w:cs="Arial"/>
-                <w:sz w:val="20"/>
-                <w:szCs w:val="20"/>
-                <w:lang w:eastAsia="es-CL"/>
-              </w:rPr>
-            </w:pPr>
-            <w:r>
-              <w:rPr>
-                <w:rFonts w:ascii="Calibri" w:hAnsi="Calibri" w:cs="Arial"/>
-                <w:sz w:val="20"/>
-                <w:szCs w:val="20"/>
-                <w:lang w:eastAsia="es-CL"/>
-              </w:rPr>
-              <w:t>David Miranda. Interfaz de usuario en sus dos modos de uso, batería de pruebas de extremo a extremo y verificación funcional del sistema en ejecución. Registra 58 confirmaciones de cambios en el repositorio de título y 19 en el repositorio de trabajo, con 58.260 líneas aportadas. Su huella se concentra en la carpeta de la interfaz y en la batería de extremo a extremo.</w:t>
-            </w:r>
-          </w:p>
-          <w:p>
-            <w:pPr>
-              <w:jc w:val="both"/>
-              <w:rPr>
-                <w:rFonts w:ascii="Calibri" w:hAnsi="Calibri" w:cs="Arial"/>
-                <w:sz w:val="20"/>
-                <w:szCs w:val="20"/>
-                <w:lang w:eastAsia="es-CL"/>
-              </w:rPr>
-            </w:pPr>
-            <w:r>
-              <w:rPr>
-                <w:rFonts w:ascii="Calibri" w:hAnsi="Calibri" w:cs="Arial"/>
-                <w:sz w:val="20"/>
-                <w:szCs w:val="20"/>
-                <w:lang w:eastAsia="es-CL"/>
-              </w:rPr>
-              <w:t>El número de confirmaciones no se usa como medida de aporte, porque cada integrante integra con una frecuencia distinta: uno confirma cambios acotados y frecuentes, y el otro agrupa el trabajo de una pantalla completa antes de integrarla. Cruzando ambos repositorios y el volumen de código aportado, el aporte resulta equivalente y no se superpone: ningún componente del sistema tiene dos autores, lo que permite atribuir cada archivo a quien lo escribió. Cuando un integrante confirma material escrito por el ot</w:t>
-            </w:r>
-            <w:r>
-              <w:rPr>
-                <w:rFonts w:ascii="Calibri" w:hAnsi="Calibri" w:cs="Arial"/>
-                <w:sz w:val="20"/>
-                <w:szCs w:val="20"/>
-                <w:lang w:eastAsia="es-CL"/>
-              </w:rPr>
-              <w:t>ro, la autoría original se conserva en el registro para no alterar esa atribución. El contrato entre ambas partes son las rutas de la interfaz de programación, documentadas y versionadas, y la revisión cruzada asegura que ambos integrantes conozcan el funcionamiento de la parte que no desarrollaron.</w:t>
+              <w:t>Marcelo Pino. Servidor, modelo de datos y migraciones, cumplimiento normativo tributario y sanitario, contenedorización, y las baterías de pruebas unitarias y de integración. Registra 67 confirmaciones de cambios en el repositorio de título. Es autor de las carpetas del servidor, de las migraciones de ambos motores de base de datos, de los dieciséis conjuntos de pruebas unitarias del servidor y de la documentación técnica.</w:t>
+            </w:r>
+          </w:p>
+          <w:p>
+            <w:pPr>
+              <w:jc w:val="both"/>
+              <w:rPr>
+                <w:rFonts w:ascii="Calibri" w:hAnsi="Calibri" w:cs="Arial"/>
+                <w:sz w:val="20"/>
+                <w:szCs w:val="20"/>
+                <w:lang w:eastAsia="es-CL"/>
+              </w:rPr>
+            </w:pPr>
+            <w:r>
+              <w:rPr>
+                <w:rFonts w:ascii="Calibri" w:hAnsi="Calibri" w:cs="Arial"/>
+                <w:sz w:val="20"/>
+                <w:szCs w:val="20"/>
+                <w:lang w:eastAsia="es-CL"/>
+              </w:rPr>
+              <w:t>David Miranda. Interfaz de usuario en sus dos modos de uso, batería de pruebas de extremo a extremo y verificación funcional del sistema en ejecución. Registra 60 confirmaciones de cambios en el repositorio de título. Es autor de la carpeta completa de la interfaz, de sus pruebas unitarias y de los diez módulos de la batería de extremo a extremo.</w:t>
+            </w:r>
+          </w:p>
+          <w:p>
+            <w:pPr>
+              <w:jc w:val="both"/>
+              <w:rPr>
+                <w:rFonts w:ascii="Calibri" w:hAnsi="Calibri" w:cs="Arial"/>
+                <w:sz w:val="20"/>
+                <w:szCs w:val="20"/>
+                <w:lang w:eastAsia="es-CL"/>
+              </w:rPr>
+            </w:pPr>
+            <w:r>
+              <w:rPr>
+                <w:rFonts w:ascii="Calibri" w:hAnsi="Calibri" w:cs="Arial"/>
+                <w:sz w:val="20"/>
+                <w:szCs w:val="20"/>
+                <w:lang w:eastAsia="es-CL"/>
+              </w:rPr>
+              <w:t>El reparto se verifica abriendo las carpetas del repositorio, donde cada componente tiene un único autor: ningún archivo del sistema fue escrito por ambos. No se emplea el volumen de líneas como medida de aporte, porque quien integra el código de una carpeta al repositorio de evidencias queda registrado como autor de esas líneas aunque no las haya escrito, de modo que esa cifra describe quién sincronizó y no quién desarrolló. Cuando un integrante confirma material escrito por el otro, la autoría original se conserva en el registro para no alterar la atribución. El contrato entre ambas partes son las rutas de la interfaz de programación, documentadas y versionadas, y la revisión cruzada asegura que ambos integrantes conozcan el funcionamiento de la parte que no desarrollaron.</w:t>
+            </w:r>
+            <w:r>
+              <w:rPr>
+                <w:rFonts w:ascii="Calibri" w:hAnsi="Calibri" w:cs="Arial"/>
+                <w:sz w:val="20"/>
+                <w:szCs w:val="20"/>
+                <w:lang w:eastAsia="es-CL"/>
+              </w:rPr>
             </w:r>
           </w:p>
         </w:tc>
@@ -3875,7 +3874,7 @@
                 <w:szCs w:val="20"/>
                 <w:lang w:eastAsia="es-CL"/>
               </w:rPr>
-              <w:t>Se incorporaron 18 pruebas unitarias de la interfaz, sobre sus reglas de negocio, y 11 pruebas del contrato que la une al servidor. La batería del servidor llegó a 210 pruebas unitarias y 87 de integración, con las 72 rutas cubiertas.</w:t>
+              <w:t>Se incorporaron 30 pruebas unitarias de la interfaz, sobre sus reglas de negocio, y 11 pruebas del contrato que la une al servidor. La batería del servidor llegó a 210 pruebas unitarias y 87 de integración, con las 72 rutas cubiertas.</w:t>
             </w:r>
             <w:r>
               <w:rPr>

</xml_diff>

<commit_message>
Actualizar el informe de avance con las correcciones de la revisión docente
</commit_message>
<xml_diff>
--- a/FASE 2/Evidencias Grupales/2.4_Guía Estudiante_Fase 2_Desarrollo Proyecto APT.docx
+++ b/FASE 2/Evidencias Grupales/2.4_Guía Estudiante_Fase 2_Desarrollo Proyecto APT.docx
@@ -704,7 +704,7 @@
                 <w:szCs w:val="20"/>
                 <w:lang w:eastAsia="es-CL"/>
               </w:rPr>
-              <w:t>Objetivo específico 1, modelo de datos. Cumplido. Se implementó el esquema definitivo de 30 tablas sobre una persistencia dual: SQLite en el terminal del local y PostgreSQL en la nube. El esquema evoluciona mediante 16 migraciones versionadas y una tabla de control de migraciones, de modo que una instalación existente se actualiza sin pérdida de datos.</w:t>
+              <w:t>Objetivo específico 1, modelo de datos. Cumplido. Se implementó el esquema definitivo de 29 tablas sobre una persistencia dual: SQLite en el terminal del local y PostgreSQL en la nube. El esquema evoluciona mediante 17 migraciones versionadas y una tabla de control de migraciones, de modo que una instalación existente se actualiza sin pérdida de datos.</w:t>
             </w:r>
           </w:p>
           <w:p>
@@ -1325,7 +1325,7 @@
                 <w:szCs w:val="20"/>
                 <w:lang w:eastAsia="es-CL"/>
               </w:rPr>
-              <w:t>Evidencia 1. Repositorio Git del proyecto de título, con historial por integrante. Contiene 127 confirmaciones de cambios entre el 28 de agosto y el 20 de octubre de 2026, de las cuales 67 corresponden a Marcelo Pino y 60 a David Miranda. Las de Marcelo Pino figuran bajo dos identificadores: 66 con su cuenta institucional y una, de la documentación de la Fase 1, con un correo personal registrado al inicio del proyecto. Las evidencias se organizan en la estructura de carpetas por fase y tipo que exige la asignatura, con los nombres de archivo en el formato solicitado. El desarrollo diario se versiona además en el repositorio de trabajo del equipo, cuyos avances se incorporan al repositorio de título como evidencia de sistema. La totalidad de las evidencias descritas en este informe se encuentra confirmada en el repositorio remoto.</w:t>
+              <w:t>Evidencia 1. Repositorio Git del proyecto de título, con historial por integrante. Contiene 116 confirmaciones de cambios en la rama principal, sin contar las de integración, entre el 28 de agosto y el 20 de octubre de 2026, repartidas en 58 de Marcelo Pino y 58 de David Miranda. Las evidencias se organizan en la estructura de carpetas por fase y tipo que exige la asignatura, con los nombres de archivo en el formato solicitado. El desarrollo diario se versiona además en el repositorio de trabajo del equipo, cuyos avances se incorporan al repositorio de título como evidencia de sistema. La totalidad de las evidencias descritas en este informe se encuentra confirmada en el repositorio remoto.</w:t>
             </w:r>
             <w:r>
               <w:rPr>
@@ -1383,32 +1383,32 @@
                 <w:szCs w:val="20"/>
                 <w:lang w:eastAsia="es-CL"/>
               </w:rPr>
-              <w:t>Evidencia 3. Modelo de datos implementado. Esquema de 30 tablas con 16 migraciones versionadas para cada motor de base de datos, aplicadas automáticamente al iniciar el sistema. Evidencia el diseño y la implementación de un modelo escalable en el tiempo, ya que una instalación existente se actualiza sin recrear el esquema ni perder información. Una suite de pruebas compara ambos esquemas tabla por tabla, de modo que una migración que alcance a un solo motor se detecta de inmediato.</w:t>
-            </w:r>
-          </w:p>
-          <w:p>
-            <w:pPr>
-              <w:jc w:val="both"/>
-            </w:pPr>
-          </w:p>
-          <w:p>
-            <w:pPr>
-              <w:jc w:val="both"/>
-              <w:rPr>
-                <w:rFonts w:ascii="Calibri" w:hAnsi="Calibri" w:cs="Arial"/>
-                <w:sz w:val="20"/>
-                <w:szCs w:val="20"/>
-                <w:lang w:eastAsia="es-CL"/>
-              </w:rPr>
-            </w:pPr>
-            <w:r>
-              <w:rPr>
-                <w:rFonts w:ascii="Calibri" w:hAnsi="Calibri" w:cs="Arial"/>
-                <w:sz w:val="20"/>
-                <w:szCs w:val="20"/>
-                <w:lang w:eastAsia="es-CL"/>
-              </w:rPr>
-              <w:t>Evidencia 4. Batería de pruebas automatizadas. Sobre el servidor, 210 pruebas unitarias repartidas en dieciséis conjuntos y 87 pruebas de integración en dieciséis conjuntos, que en conjunto ejercitan las 72 rutas de la interfaz de programación, sin dejar ninguna sin cubrir. Sobre la interfaz, 30 pruebas unitarias de sus reglas de negocio y 11 pruebas del contrato que la une al servidor. Sobre el sistema en ejecución, 109 comprobaciones de extremo a extremo, con reporte fechado por cada corrida; la última, del 20 de octubre de 2026, no registra fallas. La batería se ejecuta contra los dos motores de base de datos, el de la nube y el del terminal, porque una sentencia válida en uno puede no estarlo en el otro. La cobertura del servidor, medida sobre ambas baterías, alcanza el 78,7 % de las sentencias, y supera el 85 % en los módulos de reglas de negocio. Evidencia el diseño y la aplicación de pruebas de validación del producto.</w:t>
+              <w:t>Evidencia 3. Modelo de datos implementado. Esquema de 29 tablas con 17 migraciones versionadas para cada motor de base de datos, aplicadas automáticamente al iniciar el sistema. Evidencia el diseño y la implementación de un modelo escalable en el tiempo, ya que una instalación existente se actualiza sin recrear el esquema ni perder información. Una suite de pruebas compara ambos esquemas tabla por tabla, de modo que una migración que alcance a un solo motor se detecta de inmediato.</w:t>
+            </w:r>
+          </w:p>
+          <w:p>
+            <w:pPr>
+              <w:jc w:val="both"/>
+            </w:pPr>
+          </w:p>
+          <w:p>
+            <w:pPr>
+              <w:jc w:val="both"/>
+              <w:rPr>
+                <w:rFonts w:ascii="Calibri" w:hAnsi="Calibri" w:cs="Arial"/>
+                <w:sz w:val="20"/>
+                <w:szCs w:val="20"/>
+                <w:lang w:eastAsia="es-CL"/>
+              </w:rPr>
+            </w:pPr>
+            <w:r>
+              <w:rPr>
+                <w:rFonts w:ascii="Calibri" w:hAnsi="Calibri" w:cs="Arial"/>
+                <w:sz w:val="20"/>
+                <w:szCs w:val="20"/>
+                <w:lang w:eastAsia="es-CL"/>
+              </w:rPr>
+              <w:t>Evidencia 4. Batería de pruebas automatizadas. Sobre el servidor, 210 pruebas unitarias repartidas en dieciséis conjuntos y 84 pruebas de integración en dieciséis conjuntos, que en conjunto ejercitan las 69 rutas de la interfaz de programación, sin dejar ninguna sin cubrir. Sobre la interfaz, 30 pruebas unitarias de sus reglas de negocio y 11 pruebas del contrato que la une al servidor. Sobre el sistema en ejecución, 109 comprobaciones de extremo a extremo, con reporte fechado por cada corrida; la última, del 20 de octubre de 2026, no registra fallas. La batería se ejecuta contra los dos motores de base de datos, el de la nube y el del terminal, porque una sentencia válida en uno puede no estarlo en el otro. La cobertura del servidor, medida sobre ambas baterías, alcanza el 78,7 % de las sentencias, y supera el 85 % en los módulos de reglas de negocio. Evidencia el diseño y la aplicación de pruebas de validación del producto.</w:t>
             </w:r>
             <w:r>
               <w:rPr>
@@ -1676,47 +1676,47 @@
                 <w:szCs w:val="20"/>
                 <w:lang w:eastAsia="es-CL"/>
               </w:rPr>
-              <w:t>Marcelo Pino. Servidor, modelo de datos y migraciones, cumplimiento normativo tributario y sanitario, contenedorización, y las baterías de pruebas unitarias y de integración. Registra 67 confirmaciones de cambios en el repositorio de título. Es autor de las carpetas del servidor, de las migraciones de ambos motores de base de datos, de los dieciséis conjuntos de pruebas unitarias del servidor y de la documentación técnica.</w:t>
-            </w:r>
-          </w:p>
-          <w:p>
-            <w:pPr>
-              <w:jc w:val="both"/>
-              <w:rPr>
-                <w:rFonts w:ascii="Calibri" w:hAnsi="Calibri" w:cs="Arial"/>
-                <w:sz w:val="20"/>
-                <w:szCs w:val="20"/>
-                <w:lang w:eastAsia="es-CL"/>
-              </w:rPr>
-            </w:pPr>
-            <w:r>
-              <w:rPr>
-                <w:rFonts w:ascii="Calibri" w:hAnsi="Calibri" w:cs="Arial"/>
-                <w:sz w:val="20"/>
-                <w:szCs w:val="20"/>
-                <w:lang w:eastAsia="es-CL"/>
-              </w:rPr>
-              <w:t>David Miranda. Interfaz de usuario en sus dos modos de uso, batería de pruebas de extremo a extremo y verificación funcional del sistema en ejecución. Registra 60 confirmaciones de cambios en el repositorio de título. Es autor de la carpeta completa de la interfaz, de sus pruebas unitarias y de los diez módulos de la batería de extremo a extremo.</w:t>
-            </w:r>
-          </w:p>
-          <w:p>
-            <w:pPr>
-              <w:jc w:val="both"/>
-              <w:rPr>
-                <w:rFonts w:ascii="Calibri" w:hAnsi="Calibri" w:cs="Arial"/>
-                <w:sz w:val="20"/>
-                <w:szCs w:val="20"/>
-                <w:lang w:eastAsia="es-CL"/>
-              </w:rPr>
-            </w:pPr>
-            <w:r>
-              <w:rPr>
-                <w:rFonts w:ascii="Calibri" w:hAnsi="Calibri" w:cs="Arial"/>
-                <w:sz w:val="20"/>
-                <w:szCs w:val="20"/>
-                <w:lang w:eastAsia="es-CL"/>
-              </w:rPr>
-              <w:t>El reparto se verifica abriendo las carpetas del repositorio, donde cada componente tiene un único autor: ningún archivo del sistema fue escrito por ambos. No se emplea el volumen de líneas como medida de aporte, porque quien integra el código de una carpeta al repositorio de evidencias queda registrado como autor de esas líneas aunque no las haya escrito, de modo que esa cifra describe quién sincronizó y no quién desarrolló. Cuando un integrante confirma material escrito por el otro, la autoría original se conserva en el registro para no alterar la atribución. El contrato entre ambas partes son las rutas de la interfaz de programación, documentadas y versionadas, y la revisión cruzada asegura que ambos integrantes conozcan el funcionamiento de la parte que no desarrollaron.</w:t>
+              <w:t>Marcelo Pino. Servidor, modelo de datos y migraciones, cumplimiento normativo tributario y sanitario, contenedorización, y las baterías de pruebas unitarias y de integración. Registra 58 confirmaciones de cambios en la rama principal. Es autor de las carpetas del servidor, de las migraciones de ambos motores de base de datos, de los dieciséis conjuntos de pruebas unitarias del servidor y de la documentación técnica.</w:t>
+            </w:r>
+          </w:p>
+          <w:p>
+            <w:pPr>
+              <w:jc w:val="both"/>
+              <w:rPr>
+                <w:rFonts w:ascii="Calibri" w:hAnsi="Calibri" w:cs="Arial"/>
+                <w:sz w:val="20"/>
+                <w:szCs w:val="20"/>
+                <w:lang w:eastAsia="es-CL"/>
+              </w:rPr>
+            </w:pPr>
+            <w:r>
+              <w:rPr>
+                <w:rFonts w:ascii="Calibri" w:hAnsi="Calibri" w:cs="Arial"/>
+                <w:sz w:val="20"/>
+                <w:szCs w:val="20"/>
+                <w:lang w:eastAsia="es-CL"/>
+              </w:rPr>
+              <w:t>David Miranda. Interfaz de usuario en sus dos modos de uso, batería de pruebas de extremo a extremo y verificación funcional del sistema en ejecución. Registra 58 confirmaciones de cambios en la rama principal. Es autor de la carpeta completa de la interfaz, de sus pruebas unitarias y de los diez módulos de la batería de extremo a extremo.</w:t>
+            </w:r>
+          </w:p>
+          <w:p>
+            <w:pPr>
+              <w:jc w:val="both"/>
+              <w:rPr>
+                <w:rFonts w:ascii="Calibri" w:hAnsi="Calibri" w:cs="Arial"/>
+                <w:sz w:val="20"/>
+                <w:szCs w:val="20"/>
+                <w:lang w:eastAsia="es-CL"/>
+              </w:rPr>
+            </w:pPr>
+            <w:r>
+              <w:rPr>
+                <w:rFonts w:ascii="Calibri" w:hAnsi="Calibri" w:cs="Arial"/>
+                <w:sz w:val="20"/>
+                <w:szCs w:val="20"/>
+                <w:lang w:eastAsia="es-CL"/>
+              </w:rPr>
+              <w:t>El reparto es parejo en número de confirmaciones, 58 por integrante, y se verifica además abriendo las carpetas del repositorio, donde cada componente tiene un único autor: ningún archivo del sistema fue escrito por ambos. No se emplea el volumen de líneas como medida de aporte, porque quien integra el código de una carpeta al repositorio de evidencias queda registrado como autor de esas líneas aunque no las haya escrito, de modo que esa cifra describe quién sincronizó y no quién desarrolló. Cuando un integrante confirma material escrito por el otro, la autoría original se conserva en el registro para no alterar la atribución. El contrato entre ambas partes son las rutas de la interfaz de programación, documentadas y versionadas, y la revisión cruzada asegura que ambos integrantes conozcan el funcionamiento de la parte que no desarrollaron.</w:t>
             </w:r>
             <w:r>
               <w:rPr>
@@ -3874,7 +3874,7 @@
                 <w:szCs w:val="20"/>
                 <w:lang w:eastAsia="es-CL"/>
               </w:rPr>
-              <w:t>Se incorporaron 30 pruebas unitarias de la interfaz, sobre sus reglas de negocio, y 11 pruebas del contrato que la une al servidor. La batería del servidor llegó a 210 pruebas unitarias y 87 de integración, con las 72 rutas cubiertas.</w:t>
+              <w:t>Se incorporaron 30 pruebas unitarias de la interfaz, sobre sus reglas de negocio, y 11 pruebas del contrato que la une al servidor. La batería del servidor llegó a 210 pruebas unitarias y 87 de integración, con las 69 rutas cubiertas.</w:t>
             </w:r>
             <w:r>
               <w:rPr>
@@ -6594,7 +6594,7 @@
                 <w:szCs w:val="20"/>
                 <w:lang w:eastAsia="es-CL"/>
               </w:rPr>
-              <w:t>Actividad eliminada: tendencias de mercado obtenidas de servicios externos. Estaba construida y se retiró tras verificar que ningún proveedor consultaba internet: los indicadores se derivaban del largo del nombre del producto, de modo que el panel informaba al dueño del local una diferencia de precio contra un mercado que nunca se consultó. Obtener esos datos exige una aplicación registrada y un proceso de autorización ante cada servicio, cuyo plazo no depende del equipo.</w:t>
+              <w:t>Actividad eliminada: tendencias de mercado obtenidas de servicios externos. Estaba construida y se retiró tras verificar que ningún proveedor consultaba internet: los indicadores se derivaban del largo del nombre del producto, de modo que el panel informaba al dueño del local una diferencia de precio contra un mercado que nunca se consultó. Obtener esos datos exige una aplicación registrada y un proceso de autorización ante cada servicio, cuyo plazo no depende del equipo. El retiro está completo: la interfaz reemplazó el panel, el servidor dio de baja el módulo y sus rutas, y una migración retiró la tabla, porque su contenido declaraba una fuente externa que nunca entregó ese dato. El requisito funcional correspondiente queda declarado como retirado en el documento de arquitectura, con su motivo, en lugar de suprimirse.</w:t>
             </w:r>
           </w:p>
           <w:p>

</xml_diff>